<commit_message>
paper v2+: related work + construct checklist appendix
</commit_message>
<xml_diff>
--- a/paper/MEGA27-24-banana-vaccine-enviropig-v2.docx
+++ b/paper/MEGA27-24-banana-vaccine-enviropig-v2.docx
@@ -89,6 +89,32 @@
     <w:p>
       <w:r>
         <w:t>pip install -e . &amp;&amp; pytest - 10 tests pin epitope non-overlap, surface&gt;hydrophobic ordering, CAI=1 optimality, twin-peak pH profile shape, hydrolysis bounds, exact mass conservation, and the published-band reduction. Both studies recompute every number in this paper from source.</w:t>
+      </w:r>
+    </w:p>
+    <w:p>
+      <w:pPr>
+        <w:pStyle w:val="Heading1"/>
+      </w:pPr>
+      <w:r>
+        <w:t>Related work</w:t>
+      </w:r>
+    </w:p>
+    <w:p>
+      <w:r>
+        <w:t>Edible vaccines reached the clinic-adjacent stage with potato (LT-B) and were demonstrated in banana for HBsAg (Kumar 2005); expression level and oral immunogenicity, not antigen choice, were the bottlenecks - which is exactly where codon optimization and epitope pre-selection compute. For phytase, the Enviropig line established salivary AppA efficacy; later work modeled phytate hydrolysis in mono- and multi-compartment guts. Our contribution is a transparent, unit-verified version of both computational gates in one reproducible package.</w:t>
+      </w:r>
+    </w:p>
+    <w:p>
+      <w:pPr>
+        <w:pStyle w:val="Heading1"/>
+      </w:pPr>
+      <w:r>
+        <w:t>Appendix - construct design checklist</w:t>
+      </w:r>
+    </w:p>
+    <w:p>
+      <w:r>
+        <w:t>For each candidate construct the pipeline reports: peptide sequence and source coordinates; composite score; optimized CDS; CAI against the host table; GC fraction; max homopolymer (screened at synthesis); and for enzymes the compartment-wise hydrolysis schedule. All values in this paper were produced by the same functions the tests verify - no number is hand-entered.</w:t>
       </w:r>
     </w:p>
     <w:p>

</xml_diff>